<commit_message>
hoan thanh tach fonts in dam in nghien binh thuong
</commit_message>
<xml_diff>
--- a/src/main/resources/templates/BienBanKiemTraSauKhiChoVay.docx
+++ b/src/main/resources/templates/BienBanKiemTraSauKhiChoVay.docx
@@ -248,7 +248,14 @@
           <w:sz w:val="24"/>
         </w:rPr>
         <w:tab/>
-        <w:t>Họ và tên cán bộ kiểm tra: …………………………………………………………. ………..…………………………………………………………………………………......</w:t>
+        <w:t xml:space="preserve">Họ và tên cán bộ kiểm tra: </w:t>
+      </w:r>
+      <w:r>
+        <w:rPr>
+          <w:rFonts w:ascii="Times New Roman" w:hAnsi="Times New Roman"/>
+          <w:sz w:val="24"/>
+        </w:rPr>
+        <w:t>{{canBoTD}} – Cán bộ tín dụng Quỹ tín dụng Nhân Dân Thái Học.</w:t>
       </w:r>
     </w:p>
     <w:p>
@@ -335,20 +342,84 @@
         </w:rPr>
         <w:t>- Số CC/CCCD: {{cccdkh}}</w:t>
       </w:r>
+      <w:r>
+        <w:rPr>
+          <w:rFonts w:ascii="Times New Roman" w:hAnsi="Times New Roman"/>
+          <w:sz w:val="24"/>
+        </w:rPr>
+        <w:t xml:space="preserve">;  </w:t>
+      </w:r>
+      <w:r>
+        <w:rPr>
+          <w:rFonts w:ascii="Times New Roman" w:hAnsi="Times New Roman"/>
+          <w:sz w:val="24"/>
+        </w:rPr>
+        <w:t>Ngày cấp: {{nckh}}</w:t>
+      </w:r>
+      <w:r>
+        <w:rPr>
+          <w:rFonts w:ascii="Times New Roman" w:hAnsi="Times New Roman"/>
+          <w:sz w:val="24"/>
+        </w:rPr>
+        <w:t xml:space="preserve">;  </w:t>
+      </w:r>
+      <w:r>
+        <w:rPr>
+          <w:rFonts w:ascii="Times New Roman" w:hAnsi="Times New Roman"/>
+          <w:sz w:val="24"/>
+        </w:rPr>
+        <w:t xml:space="preserve">Nơi cấp: </w:t>
+      </w:r>
+      <w:r>
+        <w:rPr>
+          <w:rFonts w:ascii="Times New Roman" w:hAnsi="Times New Roman"/>
+          <w:sz w:val="24"/>
+          <w:szCs w:val="26"/>
+        </w:rPr>
+        <w:t>{{nccccdkh}}</w:t>
+      </w:r>
     </w:p>
     <w:p>
       <w:pPr>
         <w:rPr>
           <w:rFonts w:ascii="Times New Roman" w:hAnsi="Times New Roman"/>
           <w:sz w:val="24"/>
-        </w:rPr>
-      </w:pPr>
-      <w:r>
-        <w:rPr>
-          <w:rFonts w:ascii="Times New Roman" w:hAnsi="Times New Roman"/>
-          <w:sz w:val="24"/>
-        </w:rPr>
-        <w:t>- Ngày cấp: {{nckh}}</w:t>
+          <w:szCs w:val="26"/>
+        </w:rPr>
+      </w:pPr>
+      <w:r>
+        <w:rPr>
+          <w:rFonts w:ascii="Times New Roman" w:hAnsi="Times New Roman"/>
+          <w:b/>
+          <w:sz w:val="24"/>
+          <w:szCs w:val="26"/>
+        </w:rPr>
+        <w:t>2. Ông/bà</w:t>
+      </w:r>
+      <w:r>
+        <w:rPr>
+          <w:rFonts w:ascii="Times New Roman" w:hAnsi="Times New Roman"/>
+          <w:b/>
+          <w:sz w:val="24"/>
+          <w:szCs w:val="26"/>
+        </w:rPr>
+        <w:t>:</w:t>
+      </w:r>
+      <w:r>
+        <w:rPr>
+          <w:rFonts w:ascii="Times New Roman" w:hAnsi="Times New Roman"/>
+          <w:sz w:val="24"/>
+          <w:szCs w:val="26"/>
+        </w:rPr>
+        <w:t xml:space="preserve">                 </w:t>
+      </w:r>
+      <w:r>
+        <w:rPr>
+          <w:rFonts w:ascii="Times New Roman" w:hAnsi="Times New Roman"/>
+          <w:sz w:val="24"/>
+          <w:szCs w:val="26"/>
+        </w:rPr>
+        <w:t>{{ntkh}}</w:t>
       </w:r>
     </w:p>
     <w:p>
@@ -363,16 +434,9 @@
         <w:rPr>
           <w:rFonts w:ascii="Times New Roman" w:hAnsi="Times New Roman"/>
           <w:sz w:val="24"/>
-        </w:rPr>
-        <w:t xml:space="preserve">- Nơi cấp: </w:t>
-      </w:r>
-      <w:r>
-        <w:rPr>
-          <w:rFonts w:ascii="Times New Roman" w:hAnsi="Times New Roman"/>
-          <w:sz w:val="24"/>
-          <w:szCs w:val="26"/>
-        </w:rPr>
-        <w:t>{{nccccdkh}}</w:t>
+          <w:szCs w:val="26"/>
+        </w:rPr>
+        <w:t>- Quan hệ với người được cấp tín dụng: {{qh}}</w:t>
       </w:r>
     </w:p>
     <w:p>
@@ -386,36 +450,10 @@
       <w:r>
         <w:rPr>
           <w:rFonts w:ascii="Times New Roman" w:hAnsi="Times New Roman"/>
-          <w:b/>
-          <w:sz w:val="24"/>
-          <w:szCs w:val="26"/>
-        </w:rPr>
-        <w:t>2. Ông/bà</w:t>
-      </w:r>
-      <w:r>
-        <w:rPr>
-          <w:rFonts w:ascii="Times New Roman" w:hAnsi="Times New Roman"/>
-          <w:b/>
-          <w:sz w:val="24"/>
-          <w:szCs w:val="26"/>
-        </w:rPr>
-        <w:t>:</w:t>
-      </w:r>
-      <w:r>
-        <w:rPr>
-          <w:rFonts w:ascii="Times New Roman" w:hAnsi="Times New Roman"/>
-          <w:sz w:val="24"/>
-          <w:szCs w:val="26"/>
-        </w:rPr>
-        <w:t xml:space="preserve">                 </w:t>
-      </w:r>
-      <w:r>
-        <w:rPr>
-          <w:rFonts w:ascii="Times New Roman" w:hAnsi="Times New Roman"/>
-          <w:sz w:val="24"/>
-          <w:szCs w:val="26"/>
-        </w:rPr>
-        <w:t>{{ntkh}}</w:t>
+          <w:sz w:val="24"/>
+          <w:szCs w:val="26"/>
+        </w:rPr>
+        <w:t>- Hộ khẩu thường trú: {{ttnt}}</w:t>
       </w:r>
     </w:p>
     <w:p>
@@ -432,7 +470,39 @@
           <w:sz w:val="24"/>
           <w:szCs w:val="26"/>
         </w:rPr>
-        <w:t>- Quan hệ với người được cấp tín dụng: {{qh}}</w:t>
+        <w:t>- Số CC/CCCD: {{cccdnt}}</w:t>
+      </w:r>
+      <w:r>
+        <w:rPr>
+          <w:rFonts w:ascii="Times New Roman" w:hAnsi="Times New Roman"/>
+          <w:sz w:val="24"/>
+          <w:szCs w:val="26"/>
+        </w:rPr>
+        <w:t xml:space="preserve">;  </w:t>
+      </w:r>
+      <w:r>
+        <w:rPr>
+          <w:rFonts w:ascii="Times New Roman" w:hAnsi="Times New Roman"/>
+          <w:sz w:val="24"/>
+          <w:szCs w:val="26"/>
+        </w:rPr>
+        <w:t>Ngày cấp: {{nccccdnt}}</w:t>
+      </w:r>
+      <w:r>
+        <w:rPr>
+          <w:rFonts w:ascii="Times New Roman" w:hAnsi="Times New Roman"/>
+          <w:sz w:val="24"/>
+          <w:szCs w:val="26"/>
+        </w:rPr>
+        <w:t xml:space="preserve">;  </w:t>
+      </w:r>
+      <w:r>
+        <w:rPr>
+          <w:rFonts w:ascii="Times New Roman" w:hAnsi="Times New Roman"/>
+          <w:sz w:val="24"/>
+          <w:szCs w:val="26"/>
+        </w:rPr>
+        <w:t>Nơi cấp: {{nccccdnt}}</w:t>
       </w:r>
     </w:p>
     <w:p>
@@ -449,7 +519,7 @@
           <w:sz w:val="24"/>
           <w:szCs w:val="26"/>
         </w:rPr>
-        <w:t>- Hộ khẩu thường trú: {{ttnt}}</w:t>
+        <w:t>Theo hợp đồng tín dụng số: {{shdtd}} ngày {{day}} tháng {{month}} năm {{year}}.</w:t>
       </w:r>
     </w:p>
     <w:p>
@@ -466,7 +536,7 @@
           <w:sz w:val="24"/>
           <w:szCs w:val="26"/>
         </w:rPr>
-        <w:t>- Số CC/CCCD: {{cccdnt}}</w:t>
+        <w:t>Tổng số tiền vay: {{tienso}}</w:t>
       </w:r>
     </w:p>
     <w:p>
@@ -483,41 +553,62 @@
           <w:sz w:val="24"/>
           <w:szCs w:val="26"/>
         </w:rPr>
-        <w:t>- Ngày cấp: {{nccccdnt}}</w:t>
+        <w:t>Số dư nợ cho vay đến ngày kiể</w:t>
+      </w:r>
+      <w:r>
+        <w:rPr>
+          <w:rFonts w:ascii="Times New Roman" w:hAnsi="Times New Roman"/>
+          <w:sz w:val="24"/>
+          <w:szCs w:val="26"/>
+        </w:rPr>
+        <w:t>m tra: …………………..............</w:t>
       </w:r>
     </w:p>
     <w:p>
       <w:pPr>
         <w:rPr>
           <w:rFonts w:ascii="Times New Roman" w:hAnsi="Times New Roman"/>
-          <w:sz w:val="24"/>
-          <w:szCs w:val="26"/>
-        </w:rPr>
-      </w:pPr>
-      <w:r>
-        <w:rPr>
-          <w:rFonts w:ascii="Times New Roman" w:hAnsi="Times New Roman"/>
-          <w:sz w:val="24"/>
-          <w:szCs w:val="26"/>
-        </w:rPr>
-        <w:t>- Nơi cấp: {{nccccdnt}}</w:t>
+          <w:b/>
+          <w:sz w:val="24"/>
+          <w:szCs w:val="26"/>
+        </w:rPr>
+      </w:pPr>
+      <w:r>
+        <w:rPr>
+          <w:rFonts w:ascii="Times New Roman" w:hAnsi="Times New Roman"/>
+          <w:b/>
+          <w:sz w:val="24"/>
+          <w:szCs w:val="26"/>
+        </w:rPr>
+        <w:t>II. Nội dung kiêm tra:</w:t>
       </w:r>
     </w:p>
     <w:p>
       <w:pPr>
         <w:rPr>
           <w:rFonts w:ascii="Times New Roman" w:hAnsi="Times New Roman"/>
-          <w:sz w:val="24"/>
-          <w:szCs w:val="26"/>
-        </w:rPr>
-      </w:pPr>
-      <w:r>
-        <w:rPr>
-          <w:rFonts w:ascii="Times New Roman" w:hAnsi="Times New Roman"/>
-          <w:sz w:val="24"/>
-          <w:szCs w:val="26"/>
-        </w:rPr>
-        <w:t>Theo hợp đồng tín dụng số: {{shdtd}} ngày {{day}} tháng {{month}} năm {{year}}.</w:t>
+          <w:b/>
+          <w:sz w:val="24"/>
+          <w:szCs w:val="26"/>
+        </w:rPr>
+      </w:pPr>
+      <w:r>
+        <w:rPr>
+          <w:rFonts w:ascii="Times New Roman" w:hAnsi="Times New Roman"/>
+          <w:b/>
+          <w:sz w:val="24"/>
+          <w:szCs w:val="26"/>
+        </w:rPr>
+        <w:t>1. Mục đích sử dụng vố</w:t>
+      </w:r>
+      <w:r>
+        <w:rPr>
+          <w:rFonts w:ascii="Times New Roman" w:hAnsi="Times New Roman"/>
+          <w:b/>
+          <w:sz w:val="24"/>
+          <w:szCs w:val="26"/>
+        </w:rPr>
+        <w:t>n:</w:t>
       </w:r>
     </w:p>
     <w:p>
@@ -534,7 +625,23 @@
           <w:sz w:val="24"/>
           <w:szCs w:val="26"/>
         </w:rPr>
-        <w:t>Tổng số tiền vay: {{tienso}}</w:t>
+        <w:t xml:space="preserve">- Mục đích khi vay (ghi trên hợp đồng tín dụng): </w:t>
+      </w:r>
+      <w:r>
+        <w:rPr>
+          <w:rFonts w:ascii="Times New Roman" w:hAnsi="Times New Roman"/>
+          <w:sz w:val="24"/>
+          <w:szCs w:val="26"/>
+        </w:rPr>
+        <w:t xml:space="preserve"> </w:t>
+      </w:r>
+      <w:r>
+        <w:rPr>
+          <w:rFonts w:ascii="Times New Roman" w:hAnsi="Times New Roman"/>
+          <w:sz w:val="24"/>
+          <w:szCs w:val="26"/>
+        </w:rPr>
+        <w:t>{{mdvay}}</w:t>
       </w:r>
     </w:p>
     <w:p>
@@ -548,108 +655,10 @@
       <w:r>
         <w:rPr>
           <w:rFonts w:ascii="Times New Roman" w:hAnsi="Times New Roman"/>
-          <w:sz w:val="24"/>
-          <w:szCs w:val="26"/>
-        </w:rPr>
-        <w:t>Số dư nợ cho vay đến ngày kiểm tra: {{tienso}}</w:t>
-      </w:r>
-    </w:p>
-    <w:p>
-      <w:pPr>
-        <w:rPr>
-          <w:rFonts w:ascii="Times New Roman" w:hAnsi="Times New Roman"/>
-          <w:b/>
-          <w:sz w:val="24"/>
-          <w:szCs w:val="26"/>
-        </w:rPr>
-      </w:pPr>
-      <w:r>
-        <w:rPr>
-          <w:rFonts w:ascii="Times New Roman" w:hAnsi="Times New Roman"/>
-          <w:b/>
-          <w:sz w:val="24"/>
-          <w:szCs w:val="26"/>
-        </w:rPr>
-        <w:t>II. Nội dung kiêm tra:</w:t>
-      </w:r>
-    </w:p>
-    <w:p>
-      <w:pPr>
-        <w:rPr>
-          <w:rFonts w:ascii="Times New Roman" w:hAnsi="Times New Roman"/>
-          <w:b/>
-          <w:sz w:val="24"/>
-          <w:szCs w:val="26"/>
-        </w:rPr>
-      </w:pPr>
-      <w:r>
-        <w:rPr>
-          <w:rFonts w:ascii="Times New Roman" w:hAnsi="Times New Roman"/>
-          <w:b/>
-          <w:sz w:val="24"/>
-          <w:szCs w:val="26"/>
-        </w:rPr>
-        <w:t>1. Mục đích sử dụng vố</w:t>
-      </w:r>
-      <w:r>
-        <w:rPr>
-          <w:rFonts w:ascii="Times New Roman" w:hAnsi="Times New Roman"/>
-          <w:b/>
-          <w:sz w:val="24"/>
-          <w:szCs w:val="26"/>
-        </w:rPr>
-        <w:t>n:</w:t>
-      </w:r>
-    </w:p>
-    <w:p>
-      <w:pPr>
-        <w:rPr>
-          <w:rFonts w:ascii="Times New Roman" w:hAnsi="Times New Roman"/>
-          <w:sz w:val="24"/>
-          <w:szCs w:val="26"/>
-        </w:rPr>
-      </w:pPr>
-      <w:r>
-        <w:rPr>
-          <w:rFonts w:ascii="Times New Roman" w:hAnsi="Times New Roman"/>
-          <w:sz w:val="24"/>
-          <w:szCs w:val="26"/>
-        </w:rPr>
-        <w:t xml:space="preserve">- Mục đích khi vay (ghi trên hợp đồng tín dụng): </w:t>
-      </w:r>
-      <w:r>
-        <w:rPr>
-          <w:rFonts w:ascii="Times New Roman" w:hAnsi="Times New Roman"/>
-          <w:sz w:val="24"/>
-          <w:szCs w:val="26"/>
-        </w:rPr>
-        <w:t xml:space="preserve"> </w:t>
-      </w:r>
-      <w:r>
-        <w:rPr>
-          <w:rFonts w:ascii="Times New Roman" w:hAnsi="Times New Roman"/>
-          <w:sz w:val="24"/>
-          <w:szCs w:val="26"/>
-        </w:rPr>
-        <w:t>{{mdvay}}</w:t>
-      </w:r>
-    </w:p>
-    <w:p>
-      <w:pPr>
-        <w:rPr>
-          <w:rFonts w:ascii="Times New Roman" w:hAnsi="Times New Roman"/>
-          <w:sz w:val="24"/>
-          <w:szCs w:val="26"/>
-        </w:rPr>
-      </w:pPr>
-      <w:r>
-        <w:rPr>
-          <w:rFonts w:ascii="Times New Roman" w:hAnsi="Times New Roman"/>
-          <w:noProof/>
-          <w:sz w:val="24"/>
-          <w:szCs w:val="26"/>
-        </w:rPr>
-        <w:lastRenderedPageBreak/>
+          <w:noProof/>
+          <w:sz w:val="24"/>
+          <w:szCs w:val="26"/>
+        </w:rPr>
         <mc:AlternateContent>
           <mc:Choice Requires="wps">
             <w:drawing>
@@ -1092,6 +1101,7 @@
           <w:sz w:val="24"/>
           <w:szCs w:val="26"/>
         </w:rPr>
+        <w:lastRenderedPageBreak/>
         <w:t>3. Thực trạng của tài sản đảm bảo tiền vay:</w:t>
       </w:r>
     </w:p>
@@ -3123,7 +3133,7 @@
           <w:sz w:val="24"/>
           <w:szCs w:val="26"/>
         </w:rPr>
-        <w:t xml:space="preserve">                    </w:t>
+        <w:t xml:space="preserve">                 </w:t>
       </w:r>
       <w:r>
         <w:rPr>
@@ -3194,65 +3204,107 @@
           <w:sz w:val="24"/>
           <w:szCs w:val="26"/>
         </w:rPr>
-        <w:t xml:space="preserve">       </w:t>
+        <w:t xml:space="preserve"> </w:t>
+      </w:r>
+      <w:r>
+        <w:rPr>
+          <w:rFonts w:ascii="Times New Roman" w:hAnsi="Times New Roman"/>
+          <w:i/>
+          <w:noProof/>
+          <w:sz w:val="24"/>
+          <w:szCs w:val="26"/>
+        </w:rPr>
+        <w:t>(ký, ghi rõ họ tên)</w:t>
+      </w:r>
+    </w:p>
+    <w:p>
+      <w:pPr>
+        <w:rPr>
+          <w:rFonts w:ascii="Times New Roman" w:hAnsi="Times New Roman"/>
+          <w:i/>
+          <w:noProof/>
+          <w:sz w:val="24"/>
+          <w:szCs w:val="26"/>
+        </w:rPr>
+      </w:pPr>
+      <w:r>
+        <w:rPr>
+          <w:rFonts w:ascii="Times New Roman" w:hAnsi="Times New Roman"/>
+          <w:i/>
+          <w:noProof/>
+          <w:sz w:val="24"/>
+          <w:szCs w:val="26"/>
+        </w:rPr>
+        <w:t>(Sử dụng trong trường hợp khoản vay được</w:t>
+      </w:r>
+    </w:p>
+    <w:p>
+      <w:pPr>
+        <w:rPr>
+          <w:rFonts w:ascii="Times New Roman" w:hAnsi="Times New Roman"/>
+          <w:noProof/>
+          <w:sz w:val="24"/>
+          <w:szCs w:val="26"/>
+        </w:rPr>
+      </w:pPr>
+      <w:r>
+        <w:rPr>
+          <w:rFonts w:ascii="Times New Roman" w:hAnsi="Times New Roman"/>
+          <w:i/>
+          <w:noProof/>
+          <w:sz w:val="24"/>
+          <w:szCs w:val="26"/>
+        </w:rPr>
+        <w:t>bảo đảm bằng tài sản của bên thứ ba)</w:t>
+      </w:r>
+      <w:r>
+        <w:rPr>
+          <w:rFonts w:ascii="Times New Roman" w:hAnsi="Times New Roman"/>
+          <w:i/>
+          <w:noProof/>
+          <w:sz w:val="24"/>
+          <w:szCs w:val="26"/>
+        </w:rPr>
+        <w:t xml:space="preserve">                                                         </w:t>
       </w:r>
       <w:bookmarkStart w:id="0" w:name="_GoBack"/>
       <w:bookmarkEnd w:id="0"/>
       <w:r>
         <w:rPr>
           <w:rFonts w:ascii="Times New Roman" w:hAnsi="Times New Roman"/>
+          <w:b/>
           <w:i/>
           <w:noProof/>
           <w:sz w:val="24"/>
           <w:szCs w:val="26"/>
         </w:rPr>
-        <w:t>(ký, ghi rõ họ tên)</w:t>
-      </w:r>
-    </w:p>
-    <w:p>
-      <w:pPr>
-        <w:rPr>
-          <w:rFonts w:ascii="Times New Roman" w:hAnsi="Times New Roman"/>
+        <w:t>{{canBoTD</w:t>
+      </w:r>
+      <w:r>
+        <w:rPr>
+          <w:rFonts w:ascii="Times New Roman" w:hAnsi="Times New Roman"/>
+          <w:b/>
           <w:i/>
           <w:noProof/>
           <w:sz w:val="24"/>
           <w:szCs w:val="26"/>
         </w:rPr>
-      </w:pPr>
-      <w:r>
-        <w:rPr>
-          <w:rFonts w:ascii="Times New Roman" w:hAnsi="Times New Roman"/>
+        <w:t>VT</w:t>
+      </w:r>
+      <w:r>
+        <w:rPr>
+          <w:rFonts w:ascii="Times New Roman" w:hAnsi="Times New Roman"/>
+          <w:b/>
           <w:i/>
           <w:noProof/>
           <w:sz w:val="24"/>
           <w:szCs w:val="26"/>
         </w:rPr>
-        <w:t>(Sử dụng trong trường hợp khoản vay được</w:t>
-      </w:r>
-    </w:p>
-    <w:p>
-      <w:pPr>
-        <w:rPr>
-          <w:rFonts w:ascii="Times New Roman" w:hAnsi="Times New Roman"/>
-          <w:i/>
-          <w:noProof/>
-          <w:sz w:val="24"/>
-          <w:szCs w:val="26"/>
-        </w:rPr>
-      </w:pPr>
-      <w:r>
-        <w:rPr>
-          <w:rFonts w:ascii="Times New Roman" w:hAnsi="Times New Roman"/>
-          <w:i/>
-          <w:noProof/>
-          <w:sz w:val="24"/>
-          <w:szCs w:val="26"/>
-        </w:rPr>
-        <w:t>bảo đảm bằng tài sản của bên thứ ba)</w:t>
+        <w:t>}}</w:t>
       </w:r>
     </w:p>
     <w:sectPr>
-      <w:pgSz w:w="12240" w:h="15840"/>
+      <w:pgSz w:w="11906" w:h="16838" w:code="9"/>
       <w:pgMar w:top="1440" w:right="1440" w:bottom="1440" w:left="1440" w:header="720" w:footer="720" w:gutter="0"/>
       <w:cols w:space="720"/>
       <w:docGrid w:linePitch="360"/>

</xml_diff>

<commit_message>
Fix 9 loai hop dong Ngan Han
</commit_message>
<xml_diff>
--- a/src/main/resources/templates/BienBanKiemTraSauKhiChoVay.docx
+++ b/src/main/resources/templates/BienBanKiemTraSauKhiChoVay.docx
@@ -310,21 +310,6 @@
           <w:rFonts w:ascii="Times New Roman" w:hAnsi="Times New Roman"/>
           <w:sz w:val="24"/>
         </w:rPr>
-        <w:t>- Hộ khẩu thường trú: {{ttkh}}</w:t>
-      </w:r>
-    </w:p>
-    <w:p>
-      <w:pPr>
-        <w:rPr>
-          <w:rFonts w:ascii="Times New Roman" w:hAnsi="Times New Roman"/>
-          <w:sz w:val="24"/>
-        </w:rPr>
-      </w:pPr>
-      <w:r>
-        <w:rPr>
-          <w:rFonts w:ascii="Times New Roman" w:hAnsi="Times New Roman"/>
-          <w:sz w:val="24"/>
-        </w:rPr>
         <w:t>- Số CC/CCCD: {{cccdkh}}</w:t>
       </w:r>
       <w:r>
@@ -368,6 +353,28 @@
       <w:pPr>
         <w:rPr>
           <w:rFonts w:ascii="Times New Roman" w:hAnsi="Times New Roman"/>
+          <w:sz w:val="24"/>
+        </w:rPr>
+      </w:pPr>
+      <w:r>
+        <w:rPr>
+          <w:rFonts w:ascii="Times New Roman" w:hAnsi="Times New Roman"/>
+          <w:sz w:val="24"/>
+        </w:rPr>
+        <w:t>- Địa chỉ</w:t>
+      </w:r>
+      <w:r>
+        <w:rPr>
+          <w:rFonts w:ascii="Times New Roman" w:hAnsi="Times New Roman"/>
+          <w:sz w:val="24"/>
+        </w:rPr>
+        <w:t xml:space="preserve"> thường trú: {{ttkh}}</w:t>
+      </w:r>
+    </w:p>
+    <w:p>
+      <w:pPr>
+        <w:rPr>
+          <w:rFonts w:ascii="Times New Roman" w:hAnsi="Times New Roman"/>
           <w:b/>
           <w:sz w:val="24"/>
           <w:szCs w:val="26"/>
@@ -440,23 +447,6 @@
           <w:sz w:val="24"/>
           <w:szCs w:val="26"/>
         </w:rPr>
-        <w:t>- Hộ khẩu thường trú: {{ttnt}}</w:t>
-      </w:r>
-    </w:p>
-    <w:p>
-      <w:pPr>
-        <w:rPr>
-          <w:rFonts w:ascii="Times New Roman" w:hAnsi="Times New Roman"/>
-          <w:sz w:val="24"/>
-          <w:szCs w:val="26"/>
-        </w:rPr>
-      </w:pPr>
-      <w:r>
-        <w:rPr>
-          <w:rFonts w:ascii="Times New Roman" w:hAnsi="Times New Roman"/>
-          <w:sz w:val="24"/>
-          <w:szCs w:val="26"/>
-        </w:rPr>
         <w:t>- Số CC/CCCD: {{cccdnt}}</w:t>
       </w:r>
       <w:r>
@@ -490,6 +480,31 @@
           <w:szCs w:val="26"/>
         </w:rPr>
         <w:t>Nơi cấp: {{nccccdnt}}</w:t>
+      </w:r>
+    </w:p>
+    <w:p>
+      <w:pPr>
+        <w:rPr>
+          <w:rFonts w:ascii="Times New Roman" w:hAnsi="Times New Roman"/>
+          <w:sz w:val="24"/>
+          <w:szCs w:val="26"/>
+        </w:rPr>
+      </w:pPr>
+      <w:r>
+        <w:rPr>
+          <w:rFonts w:ascii="Times New Roman" w:hAnsi="Times New Roman"/>
+          <w:sz w:val="24"/>
+          <w:szCs w:val="26"/>
+        </w:rPr>
+        <w:t>- Địa chỉ</w:t>
+      </w:r>
+      <w:r>
+        <w:rPr>
+          <w:rFonts w:ascii="Times New Roman" w:hAnsi="Times New Roman"/>
+          <w:sz w:val="24"/>
+          <w:szCs w:val="26"/>
+        </w:rPr>
+        <w:t xml:space="preserve"> thường trú: {{ttnt}}</w:t>
       </w:r>
     </w:p>
     <w:p>
@@ -3260,7 +3275,7 @@
           <w:sz w:val="24"/>
           <w:szCs w:val="26"/>
         </w:rPr>
-        <w:t>(ký, ghi rõ họ tên)</w:t>
+        <w:t>(K</w:t>
       </w:r>
       <w:r>
         <w:rPr>
@@ -3270,6 +3285,16 @@
           <w:sz w:val="24"/>
           <w:szCs w:val="26"/>
         </w:rPr>
+        <w:t>ý, ghi rõ họ tên)</w:t>
+      </w:r>
+      <w:r>
+        <w:rPr>
+          <w:rFonts w:ascii="Times New Roman" w:hAnsi="Times New Roman"/>
+          <w:i/>
+          <w:noProof/>
+          <w:sz w:val="24"/>
+          <w:szCs w:val="26"/>
+        </w:rPr>
         <w:tab/>
       </w:r>
       <w:r>
@@ -3280,7 +3305,7 @@
           <w:sz w:val="24"/>
           <w:szCs w:val="26"/>
         </w:rPr>
-        <w:t xml:space="preserve"> </w:t>
+        <w:t>(K</w:t>
       </w:r>
       <w:r>
         <w:rPr>
@@ -3290,7 +3315,7 @@
           <w:sz w:val="24"/>
           <w:szCs w:val="26"/>
         </w:rPr>
-        <w:t>(ký, ghi rõ họ tên)</w:t>
+        <w:t>ý, ghi rõ họ tên)</w:t>
       </w:r>
     </w:p>
     <w:p>
@@ -3318,16 +3343,17 @@
       <w:pPr>
         <w:rPr>
           <w:rFonts w:ascii="Times New Roman" w:hAnsi="Times New Roman"/>
-          <w:noProof/>
-          <w:sz w:val="24"/>
-          <w:szCs w:val="26"/>
-        </w:rPr>
-      </w:pPr>
-      <w:r>
-        <w:rPr>
-          <w:rFonts w:ascii="Times New Roman" w:hAnsi="Times New Roman"/>
+          <w:b/>
           <w:i/>
           <w:noProof/>
+          <w:szCs w:val="26"/>
+        </w:rPr>
+      </w:pPr>
+      <w:r>
+        <w:rPr>
+          <w:rFonts w:ascii="Times New Roman" w:hAnsi="Times New Roman"/>
+          <w:i/>
+          <w:noProof/>
           <w:sz w:val="24"/>
           <w:szCs w:val="26"/>
         </w:rPr>
@@ -3372,18 +3398,162 @@
           <w:szCs w:val="26"/>
         </w:rPr>
         <w:t xml:space="preserve">  </w:t>
+      </w:r>
+      <w:r>
+        <w:rPr>
+          <w:rFonts w:ascii="Times New Roman" w:hAnsi="Times New Roman"/>
+          <w:b/>
+          <w:i/>
+          <w:noProof/>
+          <w:szCs w:val="26"/>
+        </w:rPr>
+        <w:t>{{canBoTDVT}}</w:t>
+      </w:r>
+    </w:p>
+    <w:p>
+      <w:pPr>
+        <w:rPr>
+          <w:rFonts w:ascii="Times New Roman" w:hAnsi="Times New Roman"/>
+          <w:b/>
+          <w:i/>
+          <w:noProof/>
+          <w:szCs w:val="26"/>
+        </w:rPr>
+      </w:pPr>
+    </w:p>
+    <w:p>
+      <w:pPr>
+        <w:rPr>
+          <w:rFonts w:ascii="Times New Roman" w:hAnsi="Times New Roman"/>
+          <w:b/>
+          <w:noProof/>
+          <w:szCs w:val="26"/>
+        </w:rPr>
+      </w:pPr>
+      <w:r>
+        <w:rPr>
+          <w:rFonts w:ascii="Times New Roman" w:hAnsi="Times New Roman"/>
+          <w:b/>
+          <w:i/>
+          <w:noProof/>
+          <w:szCs w:val="26"/>
+        </w:rPr>
+        <w:t xml:space="preserve">                                                                                                             </w:t>
+      </w:r>
+      <w:r>
+        <w:rPr>
+          <w:rFonts w:ascii="Times New Roman" w:hAnsi="Times New Roman"/>
+          <w:b/>
+          <w:noProof/>
+          <w:szCs w:val="26"/>
+        </w:rPr>
+        <w:t>Trưởng phòng</w:t>
+      </w:r>
+    </w:p>
+    <w:p>
+      <w:pPr>
+        <w:rPr>
+          <w:rFonts w:ascii="Times New Roman" w:hAnsi="Times New Roman"/>
+          <w:i/>
+          <w:noProof/>
+          <w:sz w:val="24"/>
+          <w:szCs w:val="26"/>
+        </w:rPr>
+      </w:pPr>
+      <w:r>
+        <w:rPr>
+          <w:rFonts w:ascii="Times New Roman" w:hAnsi="Times New Roman"/>
+          <w:b/>
+          <w:noProof/>
+          <w:szCs w:val="26"/>
+        </w:rPr>
+        <w:t xml:space="preserve">                                                                                                         </w:t>
+      </w:r>
+      <w:r>
+        <w:rPr>
+          <w:rFonts w:ascii="Times New Roman" w:hAnsi="Times New Roman"/>
+          <w:i/>
+          <w:noProof/>
+          <w:sz w:val="24"/>
+          <w:szCs w:val="26"/>
+        </w:rPr>
+        <w:t>(K</w:t>
+      </w:r>
+      <w:r>
+        <w:rPr>
+          <w:rFonts w:ascii="Times New Roman" w:hAnsi="Times New Roman"/>
+          <w:i/>
+          <w:noProof/>
+          <w:sz w:val="24"/>
+          <w:szCs w:val="26"/>
+        </w:rPr>
+        <w:t>ý, ghi rõ họ tên)</w:t>
+      </w:r>
+    </w:p>
+    <w:p>
+      <w:pPr>
+        <w:rPr>
+          <w:rFonts w:ascii="Times New Roman" w:hAnsi="Times New Roman"/>
+          <w:i/>
+          <w:noProof/>
+          <w:sz w:val="24"/>
+          <w:szCs w:val="26"/>
+        </w:rPr>
+      </w:pPr>
+    </w:p>
+    <w:p>
+      <w:pPr>
+        <w:rPr>
+          <w:rFonts w:ascii="Times New Roman" w:hAnsi="Times New Roman"/>
+          <w:i/>
+          <w:noProof/>
+          <w:sz w:val="24"/>
+          <w:szCs w:val="26"/>
+        </w:rPr>
+      </w:pPr>
+    </w:p>
+    <w:p>
+      <w:pPr>
+        <w:rPr>
+          <w:rFonts w:ascii="Times New Roman" w:hAnsi="Times New Roman"/>
+          <w:b/>
+          <w:noProof/>
+          <w:sz w:val="24"/>
+          <w:szCs w:val="26"/>
+        </w:rPr>
+      </w:pPr>
+      <w:r>
+        <w:rPr>
+          <w:rFonts w:ascii="Times New Roman" w:hAnsi="Times New Roman"/>
+          <w:i/>
+          <w:noProof/>
+          <w:sz w:val="24"/>
+          <w:szCs w:val="26"/>
+        </w:rPr>
+        <w:t xml:space="preserve">                                                                                                 </w:t>
       </w:r>
       <w:bookmarkStart w:id="0" w:name="_GoBack"/>
       <w:bookmarkEnd w:id="0"/>
       <w:r>
         <w:rPr>
           <w:rFonts w:ascii="Times New Roman" w:hAnsi="Times New Roman"/>
-          <w:b/>
           <w:i/>
           <w:noProof/>
-          <w:szCs w:val="26"/>
-        </w:rPr>
-        <w:t>{{canBoTDVT}}</w:t>
+          <w:sz w:val="24"/>
+          <w:szCs w:val="26"/>
+        </w:rPr>
+        <w:t xml:space="preserve"> </w:t>
+      </w:r>
+      <w:r>
+        <w:rPr>
+          <w:rFonts w:ascii="Times New Roman" w:hAnsi="Times New Roman"/>
+          <w:b/>
+          <w:i/>
+          <w:noProof/>
+          <w:sz w:val="24"/>
+          <w:szCs w:val="26"/>
+        </w:rPr>
+        <w:t>Vũ Thanh Hải</w:t>
       </w:r>
     </w:p>
     <w:sectPr>

</xml_diff>